<commit_message>
R04 docs: fix blank pages, duplicate captions, M11 body, M15/M16 bold
</commit_message>
<xml_diff>
--- a/docs/Ofori_Prince_Phase1_Methods_R04.docx
+++ b/docs/Ofori_Prince_Phase1_Methods_R04.docx
@@ -791,7 +791,7 @@
               <a:graphicData uri="http://schemas.openxmlformats.org/drawingml/2006/picture">
                 <pic:pic>
                   <pic:nvPicPr>
-                    <pic:cNvPr id="0" name="r04_1.png"/>
+                    <pic:cNvPr id="0" name="clean_1.png"/>
                     <pic:cNvPicPr/>
                   </pic:nvPicPr>
                   <pic:blipFill>
@@ -817,13 +817,14 @@
     <w:p>
       <w:pPr>
         <w:jc w:val="center"/>
+        <w:spacing w:before="60" w:after="180"/>
       </w:pPr>
       <w:r>
         <w:rPr>
           <w:sz w:val="19"/>
           <w:i/>
         </w:rPr>
-        <w:t>Figure 1. KAB-XGBoost-WCE pipeline applied independently to KNUST (primary) and Alzubaidi (external stress-test).</w:t>
+        <w:t>Figure 1. KAB-XGBoost-WCE pipeline applied independently to primary field data (KNUST) and external stress-test dataset (Alzubaidi 2021).</w:t>
       </w:r>
     </w:p>
     <w:p>
@@ -867,18 +868,6 @@
     </w:p>
     <w:p>
       <w:pPr>
-        <w:jc w:val="center"/>
-      </w:pPr>
-      <w:r>
-        <w:rPr>
-          <w:sz w:val="19"/>
-          <w:i/>
-        </w:rPr>
-        <w:t>Figure 1. KAB-XGBoost-WCE pipeline applied independently to primary field data (KNUST) and external stress-test dataset (Alzubaidi 2021).</w:t>
-      </w:r>
-    </w:p>
-    <w:p>
-      <w:pPr>
         <w:pStyle w:val="Heading2"/>
         <w:spacing w:after="120" w:before="240"/>
       </w:pPr>
@@ -1762,7 +1751,7 @@
               <a:graphicData uri="http://schemas.openxmlformats.org/drawingml/2006/picture">
                 <pic:pic>
                   <pic:nvPicPr>
-                    <pic:cNvPr id="0" name="r04_2.png"/>
+                    <pic:cNvPr id="0" name="clean_2.png"/>
                     <pic:cNvPicPr/>
                   </pic:nvPicPr>
                   <pic:blipFill>
@@ -1787,27 +1776,22 @@
     </w:p>
     <w:p>
       <w:pPr>
-        <w:jc w:val="center"/>
-      </w:pPr>
-      <w:r>
-        <w:rPr>
-          <w:sz w:val="19"/>
-          <w:i/>
-        </w:rPr>
-        <w:t>Figure 2. CROSS-DATASET independent replication strategy -- identical pipeline, no shared state.</w:t>
+        <w:spacing w:after="160" w:line="276"/>
+      </w:pPr>
+      <w:r>
+        <w:t>Six baselines representing major classifier families: XGBoost Baseline (Chen and Guestrin, 2016) -- the ablated form of the proposed model; Decision Tree (Breiman et al., 1984); Naive Bayes (John and Langley, 1995); Logistic Regression (Cox, 1958); SVM RBF (Cortes and Vapnik, 1995); Random Forest (Breiman, 2001). All six baselines received identical data access, identical tuning budget (GridSearchCV, same inner CV scheme, same training partition), and were evaluated under the identical 5x10-fold repeated stratified cross-validation protocol (50 fold-level estimates). Scale-sensitive models (SVM, Logistic Regression) were run on scaled features; tree-based models were run on unscaled features. Naive Bayes was retained at default settings (no meaningful hyperparameters to tune).</w:t>
       </w:r>
     </w:p>
     <w:p>
       <w:pPr>
         <w:pStyle w:val="Heading2"/>
-        <w:spacing w:after="120" w:before="240"/>
-      </w:pPr>
-      <w:r>
-        <w:rPr>
-          <w:b/>
-          <w:bCs/>
-        </w:rPr>
-        <w:t xml:space="preserve">M11. Baseline Selection and Justification</w:t>
+        <w:spacing w:before="240" w:after="120"/>
+      </w:pPr>
+      <w:r>
+        <w:rPr>
+          <w:b/>
+        </w:rPr>
+        <w:t>M11. Baseline Selection and Justification</w:t>
       </w:r>
     </w:p>
     <w:p>
@@ -1815,7 +1799,7 @@
         <w:spacing w:after="160" w:line="276"/>
       </w:pPr>
       <w:r>
-        <w:t>Six baselines representing major classifier families: XGBoost Baseline (Chen and Guestrin, 2016) -- the ablated form of the proposed model; Decision Tree (Breiman et al., 1984); Naive Bayes (John and Langley, 1995); Logistic Regression (Cox, 1958); SVM RBF (Cortes and Vapnik, 1995); Random Forest (Breiman, 2001). All six baselines received identical data access, identical tuning budget (GridSearchCV, same inner CV scheme, same training partition), and were evaluated under the identical 5x10-fold repeated stratified cross-validation protocol (50 fold-level estimates). Scale-sensitive models (SVM, Logistic Regression) were run on scaled features; tree-based models were run on unscaled features. Naive Bayes was retained at default settings (no meaningful hyperparameters to tune).</w:t>
+        <w:t xml:space="preserve">Six baselines representing major classifier families: XGBoost Baseline (Chen and Guestrin, 2016) -- the ablated form of the proposed model; Decision Tree (Breiman et al., 1984); Naive Bayes (John and Langley, 1995); Logistic Regression (Cox, 1958); SVM RBF (Cortes and Vapnik, 1995); Random Forest (Breiman, 2001). All six baselines received identical data access, identical tuning budget (GridSearchCV, same inner CV scheme, same training partition), and were evaluated under the identical 5x10-fold repeated stratified cross-validation protocol (50 fold-level estimates). Scale-sensitive models (SVM, Logistic Regression) were run on scaled features; tree-based models were run on unscaled features. Naive Bayes was retained at default settings (no meaningful hyperparameters to tune).</w:t>
       </w:r>
     </w:p>
     <w:p>
@@ -2042,7 +2026,7 @@
               <a:graphicData uri="http://schemas.openxmlformats.org/drawingml/2006/picture">
                 <pic:pic>
                   <pic:nvPicPr>
-                    <pic:cNvPr id="0" name="r04_3.png"/>
+                    <pic:cNvPr id="0" name="clean_3.png"/>
                     <pic:cNvPicPr/>
                   </pic:nvPicPr>
                   <pic:blipFill>
@@ -2068,6 +2052,7 @@
     <w:p>
       <w:pPr>
         <w:jc w:val="center"/>
+        <w:spacing w:before="60" w:after="180"/>
       </w:pPr>
       <w:r>
         <w:rPr>
@@ -2118,18 +2103,6 @@
     </w:p>
     <w:p>
       <w:pPr>
-        <w:jc w:val="center"/>
-      </w:pPr>
-      <w:r>
-        <w:rPr>
-          <w:sz w:val="19"/>
-          <w:i/>
-        </w:rPr>
-        <w:t>Figure 3. Architectural comparison of baseline XGBoost and KAB-XGBoost-WCE showing the Modify operation and corrected asymmetry weight function.</w:t>
-      </w:r>
-    </w:p>
-    <w:p>
-      <w:pPr>
         <w:pStyle w:val="Heading2"/>
         <w:spacing w:after="120" w:before="240"/>
       </w:pPr>
@@ -2139,14 +2112,6 @@
           <w:bCs/>
         </w:rPr>
         <w:t xml:space="preserve">M13. Hyperparameter Optimisation and Tuning Budget Parity</w:t>
-      </w:r>
-    </w:p>
-    <w:p>
-      <w:pPr>
-        <w:spacing w:after="160" w:line="276"/>
-      </w:pPr>
-      <w:r>
-        <w:t xml:space="preserve">All seven models were tuned via GridSearchCV (scikit-learn v1.4) using 5-fold stratified inner cross-validation restricted exclusively to the training partition of the 80/20 hold-out split. The selection criterion was mean Macro F1 across the five inner folds. No test-set data were accessed during tuning. Baseline XGBoost was tuned with its own independent GridSearchCV call over the same depth grid as the proposed model -- it is not shared with the WCE configuration. Table 2 reports the search space and selected values for all models per dataset.</w:t>
       </w:r>
     </w:p>
     <w:p>
@@ -3381,13 +3346,12 @@
       <w:r>
         <w:rPr>
           <w:b/>
-          <w:bCs/>
-        </w:rPr>
-        <w:t>Primary metric: Macro F1-score. Weights both classes equally regardless of frequency, making it appropriate for near-balanced binary classification where minority-class recall is substantively important. Macro F1 is appropriate under near-balanced class distributions where both classes are substantively important and neither should be systematically deprioritised. It is more informative than accuracy when any residual class imbalance exists and is the conventional primary metric for this class of binary classification benchmarks.</w:t>
-      </w:r>
-      <w:r/>
+        </w:rPr>
+        <w:t xml:space="preserve">Primary metric: Macro F1-score. </w:t>
+      </w:r>
       <w:r>
         <w:rPr/>
+        <w:t xml:space="preserve">Weights both classes equally regardless of frequency, making it appropriate for near-balanced binary classification where minority-class recall is substantively important. Macro F1 is appropriate under near-balanced class distributions where both classes are substantively important and neither should be systematically deprioritised. It is more informative than accuracy when any residual class imbalance exists and is the conventional primary metric for this class of binary classification benchmarks.</w:t>
       </w:r>
     </w:p>
     <w:p>
@@ -3425,11 +3389,13 @@
       <w:r>
         <w:rPr>
           <w:b/>
-          <w:bCs/>
-        </w:rPr>
-        <w:t>Ablation -- four arms: (A) Vanilla baseline (depth=5, uniform weights); (B) Depth-only (tuned depth, uniform weights); (C) Weight-only (depth=5, corrected asymmetry weights); (D) Full KAB-XGBoost-WCE (tuned depth + corrected asymmetry weights). Exactly one component changes between adjacent arms. All four arms evaluated under the identical 5x10-fold repeated stratified cross-validation protocol (50 fold-level estimates).</w:t>
-      </w:r>
-      <w:r/>
+        </w:rPr>
+        <w:t xml:space="preserve">Ablation -- four arms: </w:t>
+      </w:r>
+      <w:r>
+        <w:rPr/>
+        <w:t xml:space="preserve">(A) Vanilla baseline (depth=5, uniform weights); (B) Depth-only (tuned depth, uniform weights); (C) Weight-only (depth=5, corrected asymmetry weights); (D) Full KAB-XGBoost-WCE (tuned depth + corrected asymmetry weights). Exactly one component changes between adjacent arms. All four arms evaluated under the identical 5x10-fold repeated stratified cross-validation protocol (50 fold-level estimates).</w:t>
+      </w:r>
     </w:p>
     <w:p>
       <w:pPr>

</xml_diff>

<commit_message>
R04 docs final: all figures rendering correctly, no blank pages, no empty boxes
</commit_message>
<xml_diff>
--- a/docs/Ofori_Prince_Phase1_Methods_R04.docx
+++ b/docs/Ofori_Prince_Phase1_Methods_R04.docx
@@ -778,6 +778,8 @@
     <w:p>
       <w:pPr>
         <w:jc w:val="center"/>
+        <w:keepNext/>
+        <w:spacing w:before="120" w:after="0"/>
       </w:pPr>
       <w:r>
         <w:drawing>
@@ -829,45 +831,6 @@
     </w:p>
     <w:p>
       <w:pPr>
-        <w:jc w:val="center"/>
-      </w:pPr>
-      <w:r>
-        <w:drawing>
-          <wp:inline xmlns:a="http://schemas.openxmlformats.org/drawingml/2006/main" xmlns:pic="http://schemas.openxmlformats.org/drawingml/2006/picture">
-            <wp:extent cx="5303520" cy="3813767"/>
-            <wp:docPr id="1" name="Picture 1"/>
-            <wp:cNvGraphicFramePr>
-              <a:graphicFrameLocks noChangeAspect="1"/>
-            </wp:cNvGraphicFramePr>
-            <a:graphic>
-              <a:graphicData uri="http://schemas.openxmlformats.org/drawingml/2006/picture">
-                <pic:pic>
-                  <pic:nvPicPr>
-                    <pic:cNvPr id="0" name="r03_fig_1.png"/>
-                    <pic:cNvPicPr/>
-                  </pic:nvPicPr>
-                  <pic:blipFill>
-                    <a:blip r:embed="rId10"/>
-                    <a:stretch>
-                      <a:fillRect/>
-                    </a:stretch>
-                  </pic:blipFill>
-                  <pic:spPr>
-                    <a:xfrm>
-                      <a:off x="0" y="0"/>
-                      <a:ext cx="5303520" cy="3813767"/>
-                    </a:xfrm>
-                    <a:prstGeom prst="rect"/>
-                  </pic:spPr>
-                </pic:pic>
-              </a:graphicData>
-            </a:graphic>
-          </wp:inline>
-        </w:drawing>
-      </w:r>
-    </w:p>
-    <w:p>
-      <w:pPr>
         <w:pStyle w:val="Heading2"/>
         <w:spacing w:after="120" w:before="240"/>
       </w:pPr>
@@ -1687,6 +1650,8 @@
     <w:p>
       <w:pPr>
         <w:jc w:val="center"/>
+        <w:keepNext/>
+        <w:spacing w:before="120" w:after="0"/>
       </w:pPr>
       <w:r>
         <w:drawing>
@@ -1737,45 +1702,6 @@
     </w:p>
     <w:p>
       <w:pPr>
-        <w:jc w:val="center"/>
-      </w:pPr>
-      <w:r>
-        <w:drawing>
-          <wp:inline xmlns:a="http://schemas.openxmlformats.org/drawingml/2006/main" xmlns:pic="http://schemas.openxmlformats.org/drawingml/2006/picture">
-            <wp:extent cx="5303520" cy="3160684"/>
-            <wp:docPr id="1" name="Picture 1"/>
-            <wp:cNvGraphicFramePr>
-              <a:graphicFrameLocks noChangeAspect="1"/>
-            </wp:cNvGraphicFramePr>
-            <a:graphic>
-              <a:graphicData uri="http://schemas.openxmlformats.org/drawingml/2006/picture">
-                <pic:pic>
-                  <pic:nvPicPr>
-                    <pic:cNvPr id="0" name="clean_2.png"/>
-                    <pic:cNvPicPr/>
-                  </pic:nvPicPr>
-                  <pic:blipFill>
-                    <a:blip r:embed="rId12"/>
-                    <a:stretch>
-                      <a:fillRect/>
-                    </a:stretch>
-                  </pic:blipFill>
-                  <pic:spPr>
-                    <a:xfrm>
-                      <a:off x="0" y="0"/>
-                      <a:ext cx="5303520" cy="3160684"/>
-                    </a:xfrm>
-                    <a:prstGeom prst="rect"/>
-                  </pic:spPr>
-                </pic:pic>
-              </a:graphicData>
-            </a:graphic>
-          </wp:inline>
-        </w:drawing>
-      </w:r>
-    </w:p>
-    <w:p>
-      <w:pPr>
         <w:spacing w:after="160" w:line="276"/>
       </w:pPr>
       <w:r>
@@ -2013,6 +1939,8 @@
     <w:p>
       <w:pPr>
         <w:jc w:val="center"/>
+        <w:keepNext/>
+        <w:spacing w:before="120" w:after="0"/>
       </w:pPr>
       <w:r>
         <w:drawing>
@@ -2060,45 +1988,6 @@
           <w:i/>
         </w:rPr>
         <w:t>Figure 3. Architectural comparison of baseline XGBoost and KAB-XGBoost-WCE showing the Modify operation and corrected asymmetry weight function.</w:t>
-      </w:r>
-    </w:p>
-    <w:p>
-      <w:pPr>
-        <w:jc w:val="center"/>
-      </w:pPr>
-      <w:r>
-        <w:drawing>
-          <wp:inline xmlns:a="http://schemas.openxmlformats.org/drawingml/2006/main" xmlns:pic="http://schemas.openxmlformats.org/drawingml/2006/picture">
-            <wp:extent cx="5029200" cy="2889115"/>
-            <wp:docPr id="1" name="Picture 1"/>
-            <wp:cNvGraphicFramePr>
-              <a:graphicFrameLocks noChangeAspect="1"/>
-            </wp:cNvGraphicFramePr>
-            <a:graphic>
-              <a:graphicData uri="http://schemas.openxmlformats.org/drawingml/2006/picture">
-                <pic:pic>
-                  <pic:nvPicPr>
-                    <pic:cNvPr id="0" name="r03_fig_3.png"/>
-                    <pic:cNvPicPr/>
-                  </pic:nvPicPr>
-                  <pic:blipFill>
-                    <a:blip r:embed="rId8"/>
-                    <a:stretch>
-                      <a:fillRect/>
-                    </a:stretch>
-                  </pic:blipFill>
-                  <pic:spPr>
-                    <a:xfrm>
-                      <a:off x="0" y="0"/>
-                      <a:ext cx="5029200" cy="2889115"/>
-                    </a:xfrm>
-                    <a:prstGeom prst="rect"/>
-                  </pic:spPr>
-                </pic:pic>
-              </a:graphicData>
-            </a:graphic>
-          </wp:inline>
-        </w:drawing>
       </w:r>
     </w:p>
     <w:p>

</xml_diff>